<commit_message>
Measure word gaps relative to previous word; fix commented braces
Co-Authored-By: Claude Sonnet 5.5 <noreply@anthropic.com>
Claude-Session: https://claude.ai/code/session_01WBiuaWYgw5SjMWwoX1Jej5
</commit_message>
<xml_diff>
--- a/ocr/samples/code.docx
+++ b/ocr/samples/code.docx
@@ -10,7 +10,7 @@
         <w:rPr>
           <w:rFonts w:ascii="Courier New" w:hAnsi="Courier New"/>
         </w:rPr>
-        <w:t>// Configure the  PosPay database context  with connection pooling and  SQL Server options</w:t>
+        <w:t>// Configure the PosPay database context with connection pooling and SQL Server options</w:t>
       </w:r>
     </w:p>
     <w:p>
@@ -21,7 +21,7 @@
         <w:rPr>
           <w:rFonts w:ascii="Courier New" w:hAnsi="Courier New"/>
         </w:rPr>
-        <w:t>&amp;  lider.Services.AddDbContextPool&lt;PosPayContext&gt;((serviceProvider,   options) =&gt;</w:t>
+        <w:t>&amp; lider.Services.AddDbContextPool&lt;PosPayContext&gt;((serviceProvider, options) =&gt;</w:t>
       </w:r>
     </w:p>
     <w:p>
@@ -43,7 +43,7 @@
         <w:rPr>
           <w:rFonts w:ascii="Courier New" w:hAnsi="Courier New"/>
         </w:rPr>
-        <w:t xml:space="preserve">    if (builder.Environment .IsDeveLlopment())</w:t>
+        <w:t xml:space="preserve">    if (builder.Environment.IsDeveLlopment())</w:t>
       </w:r>
     </w:p>
     <w:p>
@@ -65,7 +65,7 @@
         <w:rPr>
           <w:rFonts w:ascii="Courier New" w:hAnsi="Courier New"/>
         </w:rPr>
-        <w:t xml:space="preserve">        options .EnableSensitiveDataLogging();</w:t>
+        <w:t xml:space="preserve">        options.EnableSensitiveDataLogging();</w:t>
       </w:r>
     </w:p>
     <w:p>
@@ -97,7 +97,7 @@
         <w:rPr>
           <w:rFonts w:ascii="Courier New" w:hAnsi="Courier New"/>
         </w:rPr>
-        <w:t xml:space="preserve">    options .UseSqlServer(</w:t>
+        <w:t xml:space="preserve">    options.UseSqlServer(</w:t>
       </w:r>
     </w:p>
     <w:p>
@@ -108,7 +108,7 @@
         <w:rPr>
           <w:rFonts w:ascii="Courier New" w:hAnsi="Courier New"/>
         </w:rPr>
-        <w:t xml:space="preserve">        builder .Configuration.GetConnectionString("PosPay"),</w:t>
+        <w:t xml:space="preserve">        builder.Configuration.GetConnectionString("PosPay"),</w:t>
       </w:r>
     </w:p>
     <w:p>
@@ -119,7 +119,7 @@
         <w:rPr>
           <w:rFonts w:ascii="Courier New" w:hAnsi="Courier New"/>
         </w:rPr>
-        <w:t xml:space="preserve">        sqlServerOptions  =&gt;</w:t>
+        <w:t xml:space="preserve">        sqlServerOptions =&gt;</w:t>
       </w:r>
     </w:p>
     <w:p>
@@ -141,7 +141,7 @@
         <w:rPr>
           <w:rFonts w:ascii="Courier New" w:hAnsi="Courier New"/>
         </w:rPr>
-        <w:t xml:space="preserve">            sqlServerOptions .CommandTimeout(30);</w:t>
+        <w:t xml:space="preserve">            sqlServerOptions.CommandTimeout(30);</w:t>
       </w:r>
     </w:p>
     <w:p>

</xml_diff>